<commit_message>
Correct DD comment transliterations
</commit_message>
<xml_diff>
--- a/dd-comments-aligned.docx
+++ b/dd-comments-aligned.docx
@@ -144,7 +144,7 @@
               <w:rPr>
                 <w:sz w:val="18"/>
               </w:rPr>
-              <w:t>yazdan; koxsisn; ham-spah; ahlayIh dh; ham-tuxsiSn; fras(a)gird</w:t>
+              <w:t>yazdān; kōxšišn; ham-spāh; ahlāyīh; ham-tuxšišn; rasād ud dagr</w:t>
             </w:r>
           </w:p>
         </w:tc>
@@ -231,7 +231,7 @@
               <w:rPr>
                 <w:sz w:val="18"/>
               </w:rPr>
-              <w:t>skeft; koxsIdiinn; druz; gariin; wisobisn; zUrIh; yazdan</w:t>
+              <w:t>škeft; kōxšīdārīh ī; Druz; garān; wišōbišn; zūrīh; yazdān</w:t>
             </w:r>
           </w:p>
         </w:tc>
@@ -577,7 +577,7 @@
               <w:rPr>
                 <w:sz w:val="18"/>
               </w:rPr>
-              <w:t>xwesagan dostih; drodfh; ahlayih paymogfh; druz; nihanenIdarih.</w:t>
+              <w:t>xwēšīgān drīstīh; drōdīh; ahlāyīh; Druz; nihānēnīdārīh</w:t>
             </w:r>
           </w:p>
         </w:tc>
@@ -664,7 +664,7 @@
               <w:rPr>
                 <w:sz w:val="18"/>
               </w:rPr>
-              <w:t>frawahr; koxsag; spozag; w3.nag; anabag; yazdan spall; zorenag; menog xwadiiyIh I ohrmazd geugIhii pad geug paymogIh; geugIg xwadiiyIh 4 I ohrmazd; pad druz osIh 5 estisnIh framiidar</w:t>
+              <w:t>frawahr; kōxšāg; spōzāg; wānāg; ānābāg; yazdān; zōrēnāg; mēnōy xwadāyīh ī Ohrmazd gētīyīhā pad gētīy paymōgīh; mēnōy xwadāyīh ī Ohrmazd; ud Druz ōšīh-estišnīh framūdār ī</w:t>
             </w:r>
           </w:p>
         </w:tc>
@@ -751,7 +751,7 @@
               <w:rPr>
                 <w:sz w:val="18"/>
               </w:rPr>
-              <w:t>geugIg xwadiiyIh 4 I ohrmazd; pad druz osIh 5 estisnIh framiidar; gayomart; hOsang tahmurip jam fredon.; zardust husedar ud husedarmlih.</w:t>
+              <w:t>mēnōy xwadāyīh ī Ohrmazd; ud Druz ōšīh-estišnīh framūdār ī; Gayōmard; Hōšang Tahmurid Jam ud Frēdōn; Zardušt ud Ōšīdar ud Ōšīdarmāh</w:t>
             </w:r>
           </w:p>
         </w:tc>
@@ -838,7 +838,7 @@
               <w:rPr>
                 <w:sz w:val="18"/>
               </w:rPr>
-              <w:t>gayomart; hOsang tahmurip jam fredon.; zardust husedar ud husedarmlih.; yazdan pad an I menog n;;rog abezag StilyiSnihii ud; druz az an I geug-kirblha geugig-klirih agarenIdar</w:t>
+              <w:t>Gayōmard; Hōšang Tahmurid Jam ud Frēdōn; Zardušt ud Ōšīdar ud Ōšīdarmāh; yazdān pad ān ī mēnōy; nērōg abēzag- -stāyišnīhā; Druz az ān ī gētīy- -kerbīhā gētīyīg-kārīh agārēnīdār</w:t>
             </w:r>
           </w:p>
         </w:tc>
@@ -925,7 +925,7 @@
               <w:rPr>
                 <w:sz w:val="18"/>
               </w:rPr>
-              <w:t>gayomart; hOsang tahmurip jam fredon.; zardust husedar ud husedarmlih.; yazdan pad an I menog n;;rog abezag StilyiSnihii ud; druz az an I geug-kirblha geugig-klirih agarenIdar</w:t>
+              <w:t>Gayōmard; Hōšang Tahmurid Jam ud Frēdōn; Zardušt ud Ōšīdar ud Ōšīdarmāh; yazdān pad ān ī mēnōy; nērōg abēzag- -stāyišnīhā; Druz az ān ī gētīy- -kerbīhā gētīyīg-kārīh agārēnīdār</w:t>
             </w:r>
           </w:p>
         </w:tc>
@@ -1012,7 +1012,7 @@
               <w:rPr>
                 <w:sz w:val="18"/>
               </w:rPr>
-              <w:t>purr-anabiSnlha; anaftar.</w:t>
+              <w:t>ānābišn; ānāftār</w:t>
             </w:r>
           </w:p>
         </w:tc>
@@ -1099,7 +1099,7 @@
               <w:rPr>
                 <w:sz w:val="18"/>
               </w:rPr>
-              <w:t>kam; wattarlh; anabisn; anabtaglhii; spurrenld</w:t>
+              <w:t>kām; wattarīh; ānābišn; ānāftagīhā; spurrēnīd</w:t>
             </w:r>
           </w:p>
         </w:tc>
@@ -1186,7 +1186,7 @@
               <w:rPr>
                 <w:sz w:val="18"/>
               </w:rPr>
-              <w:t>koxsisn.; ke dusmen i 0 dahisn i dadar.; must • az dusmen • kOxSIdar.</w:t>
+              <w:t>kōxšišn; kē dušmen ō dahišn ī dādār; az dušmen kōxšīdār</w:t>
             </w:r>
           </w:p>
         </w:tc>
@@ -1273,7 +1273,7 @@
               <w:rPr>
                 <w:sz w:val="18"/>
               </w:rPr>
-              <w:t>must • az dusmen • kOxSIdar.; abar rasiSn'h • jumb[ag] gan(n)ag men6g</w:t>
+              <w:t>az dušmen kōxšīdār; abar waxšišn meh a-ǰumbišn ān nē abāg men6g</w:t>
             </w:r>
           </w:p>
         </w:tc>
@@ -1360,7 +1360,7 @@
               <w:rPr>
                 <w:sz w:val="18"/>
               </w:rPr>
-              <w:t>abar rasiSn'h • jumb[ag] gan(n)ag men6g</w:t>
+              <w:t>abar waxšišn meh a-ǰumbišn ān ān abāg men6g</w:t>
             </w:r>
           </w:p>
         </w:tc>
@@ -1447,7 +1447,7 @@
               <w:rPr>
                 <w:sz w:val="18"/>
               </w:rPr>
-              <w:t>anaglh; stayldarill; sta:yisn; wehIh; wattarlh</w:t>
+              <w:t>ān; stāyīdārīh; stāyišn; wehīh; wattarīh</w:t>
             </w:r>
           </w:p>
         </w:tc>
@@ -1534,7 +1534,7 @@
               <w:rPr>
                 <w:sz w:val="18"/>
               </w:rPr>
-              <w:t>freblhistan; haziingar</w:t>
+              <w:t>hištan; hāzāngar</w:t>
             </w:r>
           </w:p>
         </w:tc>
@@ -1621,7 +1621,7 @@
               <w:rPr>
                 <w:sz w:val="18"/>
               </w:rPr>
-              <w:t>freblhistan; haziingar</w:t>
+              <w:t>hištan; hāzāngar</w:t>
             </w:r>
           </w:p>
         </w:tc>
@@ -1708,7 +1708,7 @@
               <w:rPr>
                 <w:sz w:val="18"/>
               </w:rPr>
-              <w:t>anab.hed; wattarlh; awam padixsayan; zaxm ud tars; anag.h; ahog</w:t>
+              <w:t>ān; wattarlh; āwām-pādixšāyān; zaxm ud tars; anag.h; āhōg</w:t>
             </w:r>
           </w:p>
         </w:tc>
@@ -1795,7 +1795,7 @@
               <w:rPr>
                 <w:sz w:val="18"/>
               </w:rPr>
-              <w:t>anab.hed; wattarlh; awam padixsayan; zaxm ud tars; anag.h; ahog</w:t>
+              <w:t>ānābīhēd; wattarīh; pad; kām ud ān; ān; ō</w:t>
             </w:r>
           </w:p>
         </w:tc>
@@ -1882,7 +1882,7 @@
               <w:rPr>
                 <w:sz w:val="18"/>
               </w:rPr>
-              <w:t>wehan; anaglh; We8; wattaran; *wad 9-zamanih</w:t>
+              <w:t>weh; ān; We8; wattaran; and āsānīh</w:t>
             </w:r>
           </w:p>
         </w:tc>
@@ -1969,7 +1969,7 @@
               <w:rPr>
                 <w:sz w:val="18"/>
               </w:rPr>
-              <w:t>*wad 9-zamanih; dew3.n; dew3.n i anagih; wattariin [i] anaglh-kardaran; wattaran; amaraganiha</w:t>
+              <w:t>wad-zamānīh; dēwān; čē rasišn ī anāgīh; wattarān ī anāgīh-kerdārān; wattarān; amaragānīhā</w:t>
             </w:r>
           </w:p>
         </w:tc>
@@ -2056,7 +2056,7 @@
               <w:rPr>
                 <w:sz w:val="18"/>
               </w:rPr>
-              <w:t>spurr padixsayIh i dadar; a-padixsayIh i druz.</w:t>
+              <w:t>ud pādifrāh ī az; pādifrāh ī az</w:t>
             </w:r>
           </w:p>
         </w:tc>
@@ -2143,7 +2143,7 @@
               <w:rPr>
                 <w:sz w:val="18"/>
               </w:rPr>
-              <w:t>gan(n)ag men6g.</w:t>
+              <w:t>ān ān kāmag men6g</w:t>
             </w:r>
           </w:p>
         </w:tc>
@@ -2230,7 +2230,7 @@
               <w:rPr>
                 <w:sz w:val="18"/>
               </w:rPr>
-              <w:t>rastib; wehih; weh menog ",stiM</w:t>
+              <w:t>rāstīh; wehīh; weh mēnōy rāstīhā</w:t>
             </w:r>
           </w:p>
         </w:tc>
@@ -2403,7 +2403,7 @@
               <w:rPr>
                 <w:sz w:val="18"/>
               </w:rPr>
-              <w:t>winah i hamemalan; mihrodrujan; mihr-drozan; wes[ih 1; ahIayih ud druwandih; xwad dadar ohrmazd; winlihkaran; an; winah5mandan; druwandan; ahlawan; wattom</w:t>
+              <w:t>wināh ī hamēmālān; Mihr; mihr-drozan; wēšīh ud; ud druwandīh; xwad dādār Ohrmazd; wināhgārān; ān; wināh; druwandān; ahlawān; wattom</w:t>
             </w:r>
           </w:p>
         </w:tc>
@@ -2490,7 +2490,7 @@
               <w:rPr>
                 <w:sz w:val="18"/>
               </w:rPr>
-              <w:t>wihan I kirbaglh</w:t>
+              <w:t>wihān ī</w:t>
             </w:r>
           </w:p>
         </w:tc>
@@ -2577,7 +2577,7 @@
               <w:rPr>
                 <w:sz w:val="18"/>
               </w:rPr>
-              <w:t>bazakkar; kirbakkar; anaglh; wihan I kirbaglh; wiSoblhed</w:t>
+              <w:t>az; kirbakkar; ān; šnāxtan ī kerbag; wiSoblhed</w:t>
             </w:r>
           </w:p>
         </w:tc>
@@ -2664,7 +2664,7 @@
               <w:rPr>
                 <w:sz w:val="18"/>
               </w:rPr>
-              <w:t>bOy I mardoman; ahr be 0 dewan; -*rawisn 7 I menog i tan; ayadenisn i rist-axez; dewan ud druz1i.n; () yazd.an pooan</w:t>
+              <w:t>bōy ī mardōmān; āhr bē ō dēwān; ud rafišn ud mēnōy ī tan; ayādēnišn ī rist-āxēz; ud dēwān druzān; az tan bērōn</w:t>
             </w:r>
           </w:p>
         </w:tc>
@@ -2751,7 +2751,7 @@
               <w:rPr>
                 <w:sz w:val="18"/>
               </w:rPr>
-              <w:t>-*rawisn 7 I menog i tan; ayadenisn i rist-axez; dewan ud druz1i.n</w:t>
+              <w:t>ud rafišn ud mēnōy ī tan; ayādēnišn ī rist-āxēz; ud dēwān druzān</w:t>
             </w:r>
           </w:p>
         </w:tc>
@@ -2838,7 +2838,7 @@
               <w:rPr>
                 <w:sz w:val="18"/>
               </w:rPr>
-              <w:t>ahr be 0 dewan; -*rawisn 7 I menog i tan; ayadenisn i rist-axez; dewan ud druz1i.n; () yazd.an pooan; de:w3.n w3.!denisn.</w:t>
+              <w:t>gāh pad gyāg dēwān; bōy frāz tarsand mēnōy ī tan; wardēnišn pas az; dēwān ud druz1i ān; yazdān pādan; dēwān wardēnišn pas az</w:t>
             </w:r>
           </w:p>
         </w:tc>
@@ -2925,7 +2925,7 @@
               <w:rPr>
                 <w:sz w:val="18"/>
               </w:rPr>
-              <w:t>spabyan; saman kersasp</w:t>
+              <w:t>ān; Sāmān</w:t>
             </w:r>
           </w:p>
         </w:tc>
@@ -3098,7 +3098,7 @@
               <w:rPr>
                 <w:sz w:val="18"/>
               </w:rPr>
-              <w:t>kii-s getIg nest.; -iz; andar menogan; menog; kirb wenisnIg spurr ne; xrad ud zor; hangosldag wenIhed.</w:t>
+              <w:t>kii-s getIg nē; ān-iz; dar; ō; rōbāh awiš šud nē; xward ud ō; hangosldag ēd</w:t>
             </w:r>
           </w:p>
         </w:tc>
@@ -3185,7 +3185,7 @@
               <w:rPr>
                 <w:sz w:val="18"/>
               </w:rPr>
-              <w:t>-iz; andar menogan; menog; kirb wenisnIg spurr ne; xrad ud zor; hangosldag wenIhed.</w:t>
+              <w:t>ān-iz; and; mēnōyīg; wēnišnīg spurr nē; xrad ud zōr; hangōšīdag wēnīhēd</w:t>
             </w:r>
           </w:p>
         </w:tc>
@@ -3272,7 +3272,7 @@
               <w:rPr>
                 <w:sz w:val="18"/>
               </w:rPr>
-              <w:t>*dast-dahiSnlh; *mard 2 i aSo</w:t>
+              <w:t>dast-dahišnīh; mard ī ašō</w:t>
             </w:r>
           </w:p>
         </w:tc>
@@ -3359,7 +3359,7 @@
               <w:rPr>
                 <w:sz w:val="18"/>
               </w:rPr>
-              <w:t>waStan 6 I az ohnnazdIg; frebihistan; frebihistan I az ahreman; pad xwes dast-dahisnlh andar druz</w:t>
+              <w:t>waštan ī az Ohrmazdīg; frēbīhistan; frēbīhistan ī az; pad xwēš dast-dahišnīh andar Druz</w:t>
             </w:r>
           </w:p>
         </w:tc>
@@ -3446,7 +3446,7 @@
               <w:rPr>
                 <w:sz w:val="18"/>
               </w:rPr>
-              <w:t>waStan 6 I az ohnnazdIg; frebihistan; frebihistan I az ahreman; pad xwes dast-dahisnlh andar druz; xwabaran xwabartom; rist-axez</w:t>
+              <w:t>waštan ī az Ohrmazdīg; frēbīhistan; frēbīhistan ī az; pad xwēš dast-dahišnīh andar Druz; xwābarān xwābartom; rist-āxēz</w:t>
             </w:r>
           </w:p>
         </w:tc>
@@ -3619,7 +3619,7 @@
               <w:rPr>
                 <w:sz w:val="18"/>
               </w:rPr>
-              <w:t>(21.4) dadar [I] wisp-tuwan paywazed ud 0 druz wanisn 0 ahlawan snayisn 0 an I weh daman panag ud frayadag baxsoo.</w:t>
+              <w:t>dādār wisp-tuwān paywāzēd ud ō Druz wānišn ō ahlawān šnāyišn ō ān ī weh dāmān pānag ud frayādāg baxšēd čiyōn</w:t>
             </w:r>
           </w:p>
         </w:tc>
@@ -3706,7 +3706,7 @@
               <w:rPr>
                 <w:sz w:val="18"/>
               </w:rPr>
-              <w:t>freftagih; freftarlh; abaran-denIh; *ziir­ gug[ayIh]; druz-stayIh; freh-winabIh</w:t>
+              <w:t>frēftagīh; frēftārīh; abārōn-dēnīh; ī gug; Druz-stāyīh; frāy-wināhīh</w:t>
             </w:r>
           </w:p>
         </w:tc>
@@ -3793,7 +3793,7 @@
               <w:rPr>
                 <w:sz w:val="18"/>
               </w:rPr>
-              <w:t>anagih; anagih i getigig.; gumeiag 8 anagih i getIgig; dusox</w:t>
+              <w:t>anāgīh; anāgīh ī; gumēzag anāgīh ī gētīyīg; dōšox</w:t>
             </w:r>
           </w:p>
         </w:tc>
@@ -3880,7 +3880,7 @@
               <w:rPr>
                 <w:sz w:val="18"/>
               </w:rPr>
-              <w:t>ohrmazd i weh dabagan 6 dadar</w:t>
+              <w:t>bawēd Ohrmazd ī weh-dahāgān dādār</w:t>
             </w:r>
           </w:p>
         </w:tc>
@@ -4053,7 +4053,7 @@
               <w:rPr>
                 <w:sz w:val="18"/>
               </w:rPr>
-              <w:t>dew I hambiisld; handemanlhed 0 druz ud gan(n)ag</w:t>
+              <w:t>dēw ī; handēmānīhēd ō Druz ud Gannāy ud</w:t>
             </w:r>
           </w:p>
         </w:tc>
@@ -4140,7 +4140,7 @@
               <w:rPr>
                 <w:sz w:val="18"/>
               </w:rPr>
-              <w:t>wanihed; druz; druzan dus­ meniSnan; allan I widaxtag; druzan; ne bawend dewan; abe-anagIb.</w:t>
+              <w:t>wānīhēd; Druz; druzān duš-menišnān; ān ī widāxtag; druzān; nē bawēnd dēwān; abē-anāgīh</w:t>
             </w:r>
           </w:p>
         </w:tc>
@@ -4227,7 +4227,7 @@
               <w:rPr>
                 <w:sz w:val="18"/>
               </w:rPr>
-              <w:t>anagIh.</w:t>
+              <w:t>abē-anāgīh</w:t>
             </w:r>
           </w:p>
         </w:tc>
@@ -4314,7 +4314,7 @@
               <w:rPr>
                 <w:sz w:val="18"/>
               </w:rPr>
-              <w:t>druzaskan</w:t>
+              <w:t>druzaskān</w:t>
             </w:r>
           </w:p>
         </w:tc>
@@ -4401,7 +4401,7 @@
               <w:rPr>
                 <w:sz w:val="18"/>
               </w:rPr>
-              <w:t>druzaskan</w:t>
+              <w:t>druzaskān</w:t>
             </w:r>
           </w:p>
         </w:tc>
@@ -4488,7 +4488,7 @@
               <w:rPr>
                 <w:sz w:val="18"/>
               </w:rPr>
-              <w:t>kardarih; abe-mardom; gan(n)ag menog; a-weh</w:t>
+              <w:t>xwardārīh; abē-mardōm; Gannāy Mēnōy ī; a-weh</w:t>
             </w:r>
           </w:p>
         </w:tc>
@@ -4661,7 +4661,7 @@
               <w:rPr>
                 <w:sz w:val="18"/>
               </w:rPr>
-              <w:t>a-marg; a-zarman; a-soyisn; a-poyisn; a-bes; a-dard; tom; tom duslh [j] druz; duslh; [ne] xrad rast wizengar; *sken(n)ag; margenag; dus-agah; frebiig; purr-ken; wiyabanenag; wisobiig; nang-gar; wanlgar; purr-aresk.; ken; freb; wiyabiingarjh; wanldarih; wisi5biSngarih; zadarih</w:t>
+              <w:t>a-marg; a-zarmān; a-sōyišn; a-pōyišn; a-bēš; a-dard; ō; tam dušdā Druz; duš-āgāh; xrad nē rāst wizīngar; ud kēnēnāg; margēnāg; dus-agah; frēb; purr-kēn; wiyābānēnāg; wišōbāg; nanggar; wanīgar; purr-arešk; kēn; freb; wiyābāngarīh; zadārīh; wišōbišngarīh; zadarih</w:t>
             </w:r>
           </w:p>
         </w:tc>
@@ -4748,7 +4748,7 @@
               <w:rPr>
                 <w:sz w:val="18"/>
               </w:rPr>
-              <w:t>zofiiy; dewjg; spurr-druxtlirjh; wanenjdan; abesjhenldan; zUr-mihoxtagjha</w:t>
+              <w:t>zofāy; dēwīg; spurr-druxtārīh; wanīyēnīdan; abesīhēnīdan; zūr-mihōxtagīhā</w:t>
             </w:r>
           </w:p>
         </w:tc>
@@ -4835,7 +4835,7 @@
               <w:rPr>
                 <w:sz w:val="18"/>
               </w:rPr>
-              <w:t>spurr-druxtlirjh; wanenjdan; abesjhenldan; zUr-mihoxtagjha</w:t>
+              <w:t>spurr-druxtārīh; wanīyēnīdan; abesīhēnīdan; zūr-mihōxtagīhā</w:t>
             </w:r>
           </w:p>
         </w:tc>
@@ -4922,7 +4922,7 @@
               <w:rPr>
                 <w:sz w:val="18"/>
               </w:rPr>
-              <w:t>dewjg; spurr-druxtlirjh; wanenjdan; abesjhenldan; zUr-mihoxtagjha; pad andar ne histan 10 [1] oy druz " parwast i rosnan.</w:t>
+              <w:t>dēwān; spurr-druxtārīh; wanīyēnīdan; abesīhēnīdan; zūr-mihōxtagīhā; pad andar nē hištan ōy Druz ō parwast ī rōšnān</w:t>
             </w:r>
           </w:p>
         </w:tc>
@@ -5009,7 +5009,7 @@
               <w:rPr>
                 <w:sz w:val="18"/>
               </w:rPr>
-              <w:t>dr6zisn; k6xsisn; zanisn</w:t>
+              <w:t>drōzišn; kōxšišn; zanišn</w:t>
             </w:r>
           </w:p>
         </w:tc>
@@ -5096,7 +5096,7 @@
               <w:rPr>
                 <w:sz w:val="18"/>
               </w:rPr>
-              <w:t>abes1h1d­ dew1h; wiSuft-ahremanih; wany-druz1h; nest-petyarag1h.; drozisn</w:t>
+              <w:t>abesīhīd-dēwīh; wišuft-Ahrimenīh; Druz; nēst-petyāragīh; drōzišn</w:t>
             </w:r>
           </w:p>
         </w:tc>
@@ -5183,7 +5183,7 @@
               <w:rPr>
                 <w:sz w:val="18"/>
               </w:rPr>
-              <w:t>purr-wattarIh druz; kard-espasan ahlawan</w:t>
+              <w:t>purr-wattarīh Druz; kerd-spāsān ahlawān</w:t>
             </w:r>
           </w:p>
         </w:tc>
@@ -5270,7 +5270,7 @@
               <w:rPr>
                 <w:sz w:val="18"/>
               </w:rPr>
-              <w:t>kard-espasan ahlawan; gurdag I harnbadIg [I) a-wirast bowandagIha koxsend [ud) andar ardIg ud wanend harnbadIg.; dewan zanisn</w:t>
+              <w:t>kerd-spāsān ahlawān; gurdag ī hambedīg ī a-wirāst bowandagīhā kōxšēnd andar ardīg ud wānēnd hambedīg; dēwān zanišn</w:t>
             </w:r>
           </w:p>
         </w:tc>
@@ -5357,7 +5357,7 @@
               <w:rPr>
                 <w:sz w:val="18"/>
               </w:rPr>
-              <w:t>anlig1h 1 geng; anlig1h 1 geng pad hame1g zlndagTh 1 abag dard.</w:t>
+              <w:t>anāgīh ud ēn; anāgīh ī gētīy pad hamēyīg zīndagīh ī abāg dard</w:t>
             </w:r>
           </w:p>
         </w:tc>
@@ -5444,7 +5444,7 @@
               <w:rPr>
                 <w:sz w:val="18"/>
               </w:rPr>
-              <w:t>an druz , frebag gohrag ud gan(n)ag; pes-koxsidar; akoman; xesm; dwarng; anag-kam; zarman; biisasp; tang,h; niyaz; way; waran; astwihad; wizars dew; dewan ud druzan.; tar [ud] tom; wak(7); *gazdum; spus; wis; zahr; winahlsn; dus-dfinag</w:t>
+              <w:t>ān Druz ī frēbāg- -gōhrag ud ganāg; pēš-kōxšīdār; Akōman; Xešm; dwārāg; anāg-kām; Zarmān; Būšāsp; ān; niyāzēnāg; Wāy; Waran; Astwihād; Wizariš dēw; dēwān ud druzān; tār tom; Wāy 7; gazdum; spiš; wiš; zahr; wināhišn; duš-dānāg</w:t>
             </w:r>
           </w:p>
         </w:tc>
@@ -5531,7 +5531,7 @@
               <w:rPr>
                 <w:sz w:val="18"/>
               </w:rPr>
-              <w:t>dewan dew mazantom; dew ud druz; tarnlg gohr druz; tar-tohmagan dewan; dastgraw kardan i ruwanan pad druwandlh mh.; abesihenidan i zIndagan pad margih; zor</w:t>
+              <w:t>dēwān dēw mazantom; dēw ud Druz; tamīg-gōhr Druz; -tohmagān dēwān; dastgraw kerdan ī ruwānān pad druwandīh rāh; ī zīndagān pad margīh; zōr</w:t>
             </w:r>
           </w:p>
         </w:tc>
@@ -5618,7 +5618,7 @@
               <w:rPr>
                 <w:sz w:val="18"/>
               </w:rPr>
-              <w:t>tarnlg gohr druz; tar-tohmagan dewan; dastgraw kardan i ruwanan pad druwandlh mh.; abesihenidan i zIndagan pad margih; zor; dus­ danag I xwanlhed astwihad; wiziinned aSlOmandan wiSobay.'; tab dew; biisasp dew; az dew</w:t>
+              <w:t>tamīg-gōhr Druz; -tohmagān dēwān; dastgraw kerdan ī ruwānān pad druwandīh rāh; ī zīndagān pad margīh; zōr; duš-dānāg ī xwānīhēd Astwihād; wizārīhēd astōmandān wišōbēš; Tab dēw; Būšāsp dēw; Āz dēw</w:t>
             </w:r>
           </w:p>
         </w:tc>
@@ -5705,7 +5705,7 @@
               <w:rPr>
                 <w:sz w:val="18"/>
               </w:rPr>
-              <w:t>dastgraw kardan i ruwanan pad druwandlh mh.; dus­ danag I xwanlhed astwihad; wiziinned aSlOmandan wiSobay.'; tab dew; biisasp dew; az dew</w:t>
+              <w:t>dastgraw kerdan ī ruwānān pad druwandīh rāh; duš-dānāg ī xwānīhēd Astwihād; wizārīhēd astōmandān wišōbēš; Tab dēw; Būšāsp dēw; Āz dēw</w:t>
             </w:r>
           </w:p>
         </w:tc>
@@ -5792,7 +5792,7 @@
               <w:rPr>
                 <w:sz w:val="18"/>
               </w:rPr>
-              <w:t>druwandenjdan; dro; mihoxt.; dro-den'h; ahIaw­ iz-denlh</w:t>
+              <w:t>ruwān; drōw; mihōxt; dēn; ahIaw­ iz-denlh</w:t>
             </w:r>
           </w:p>
         </w:tc>
@@ -5879,7 +5879,7 @@
               <w:rPr>
                 <w:sz w:val="18"/>
               </w:rPr>
-              <w:t>dro-den'h; ahIaw­ iz-denlh; frahjdan; parIgan; an en; tamigan 8 gohran; anag,h , [pad] man 14 [1] awesan l' dew.; dard; marg</w:t>
+              <w:t>dēn; ahIaw­ iz-denlh; rāh; parīgān; ān; tamīgān gōhrān; anāgīh ī mān ō-šān dēw ud; dard; marg</w:t>
             </w:r>
           </w:p>
         </w:tc>
@@ -5966,7 +5966,7 @@
               <w:rPr>
                 <w:sz w:val="18"/>
               </w:rPr>
-              <w:t>parIgan; an en; tamigan 8 gohran; anag,h , [pad] man 14 [1] awesan l' dew.; dard; marg; dewan karnal'g; mazan'gan dewan; druz3n</w:t>
+              <w:t>parīgān; ān; tamīgān gōhrān; anāgīh ī mān ō-šān dēw ud; dard; marg; dēwān kamālīg; māzanīgān dēwān; Druz</w:t>
             </w:r>
           </w:p>
         </w:tc>
@@ -6053,7 +6053,7 @@
               <w:rPr>
                 <w:sz w:val="18"/>
               </w:rPr>
-              <w:t>anag,h , [pad] man 14 [1] awesan l' dew.; dard; marg; dewan karnal'g; mazan'gan dewan; druz3n</w:t>
+              <w:t>anāgīh ī mān ō-šān dēw ud; dard; marg; dēwān kamālīg; māzanīgān dēwān; Druz</w:t>
             </w:r>
           </w:p>
         </w:tc>
@@ -6140,7 +6140,7 @@
               <w:rPr>
                 <w:sz w:val="18"/>
               </w:rPr>
-              <w:t>anag,h , [pad] man 14 [1] awesan l' dew.; dard; marg; dewan karnal'g; mazan'gan dewan; druz3n</w:t>
+              <w:t>anāgīh ī mān ō-šān dēw ud; dard; marg; dēwān kamālīg; māzanīgān dēwān; Druz</w:t>
             </w:r>
           </w:p>
         </w:tc>

</xml_diff>